<commit_message>
Répartition des tâche sur le GDD
</commit_message>
<xml_diff>
--- a/GDD.docx
+++ b/GDD.docx
@@ -9,6 +9,46 @@
       </w:pPr>
       <w:r>
         <w:t>Game Design Document</w:t>
+      </w:r>
+    </w:p>
+    <w:p>
+      <w:r>
+        <w:rPr>
+          <w:highlight w:val="red"/>
+        </w:rPr>
+        <w:t>BRIGAULT Elise</w:t>
+      </w:r>
+    </w:p>
+    <w:p>
+      <w:r>
+        <w:rPr>
+          <w:highlight w:val="green"/>
+        </w:rPr>
+        <w:t>BUTTET Mathieu</w:t>
+      </w:r>
+    </w:p>
+    <w:p>
+      <w:r>
+        <w:rPr>
+          <w:highlight w:val="magenta"/>
+        </w:rPr>
+        <w:t>RODRIGUES Anthony</w:t>
+      </w:r>
+    </w:p>
+    <w:p>
+      <w:r>
+        <w:rPr>
+          <w:highlight w:val="yellow"/>
+        </w:rPr>
+        <w:t>RODRIGUES Marjolène</w:t>
+      </w:r>
+    </w:p>
+    <w:p>
+      <w:r>
+        <w:rPr>
+          <w:highlight w:val="cyan"/>
+        </w:rPr>
+        <w:t>SERRAF Jordan</w:t>
       </w:r>
     </w:p>
     <w:p>
@@ -18,8 +58,14 @@
           <w:ilvl w:val="0"/>
           <w:numId w:val="1"/>
         </w:numPr>
-      </w:pPr>
-      <w:r>
+        <w:rPr>
+          <w:highlight w:val="magenta"/>
+        </w:rPr>
+      </w:pPr>
+      <w:r>
+        <w:rPr>
+          <w:highlight w:val="magenta"/>
+        </w:rPr>
         <w:t>Vision globale</w:t>
       </w:r>
     </w:p>
@@ -115,6 +161,9 @@
         <w:pStyle w:val="Titre2"/>
       </w:pPr>
       <w:r>
+        <w:rPr>
+          <w:highlight w:val="magenta"/>
+        </w:rPr>
         <w:t>Histoire</w:t>
       </w:r>
     </w:p>
@@ -128,6 +177,9 @@
         <w:pStyle w:val="Titre2"/>
       </w:pPr>
       <w:r>
+        <w:rPr>
+          <w:highlight w:val="magenta"/>
+        </w:rPr>
         <w:t>Scénario</w:t>
       </w:r>
     </w:p>
@@ -136,12 +188,50 @@
         <w:t>[remplir]</w:t>
       </w:r>
     </w:p>
-    <w:p/>
-    <w:p>
-      <w:pPr>
-        <w:pStyle w:val="Titre2"/>
-      </w:pPr>
-      <w:r>
+    <w:p>
+      <w:r>
+        <w:t xml:space="preserve">Ce jeu s’inscrit dans le genre de l’observation sociétale : </w:t>
+      </w:r>
+      <w:proofErr w:type="spellStart"/>
+      <w:r>
+        <w:t>un.e</w:t>
+      </w:r>
+      <w:proofErr w:type="spellEnd"/>
+      <w:r>
+        <w:t xml:space="preserve"> scientifique est </w:t>
+      </w:r>
+      <w:proofErr w:type="spellStart"/>
+      <w:r>
+        <w:t>chargé.e</w:t>
+      </w:r>
+      <w:proofErr w:type="spellEnd"/>
+      <w:r>
+        <w:t xml:space="preserve"> d’observer un écosystème inconnu afin de comprendre son fonctionnement.</w:t>
+      </w:r>
+    </w:p>
+    <w:p>
+      <w:r>
+        <w:t xml:space="preserve">L’écosystème est simulé en </w:t>
+      </w:r>
+      <w:r>
+        <w:rPr>
+          <w:b/>
+          <w:bCs/>
+        </w:rPr>
+        <w:t>temps réel</w:t>
+      </w:r>
+      <w:r>
+        <w:t xml:space="preserve"> à partir de l’instant de sa création.</w:t>
+      </w:r>
+    </w:p>
+    <w:p>
+      <w:pPr>
+        <w:pStyle w:val="Titre2"/>
+      </w:pPr>
+      <w:r>
+        <w:rPr>
+          <w:highlight w:val="magenta"/>
+        </w:rPr>
         <w:t>Dialogues</w:t>
       </w:r>
     </w:p>
@@ -155,6 +245,9 @@
         <w:pStyle w:val="Titre2"/>
       </w:pPr>
       <w:r>
+        <w:rPr>
+          <w:highlight w:val="magenta"/>
+        </w:rPr>
         <w:t>Personnages</w:t>
       </w:r>
     </w:p>
@@ -168,6 +261,9 @@
         <w:pStyle w:val="Titre2"/>
       </w:pPr>
       <w:r>
+        <w:rPr>
+          <w:highlight w:val="red"/>
+        </w:rPr>
         <w:t>Art</w:t>
       </w:r>
     </w:p>
@@ -181,6 +277,9 @@
         <w:pStyle w:val="Titre2"/>
       </w:pPr>
       <w:r>
+        <w:rPr>
+          <w:highlight w:val="red"/>
+        </w:rPr>
         <w:t>Audio</w:t>
       </w:r>
     </w:p>
@@ -198,6 +297,7 @@
         </w:numPr>
       </w:pPr>
       <w:r>
+        <w:lastRenderedPageBreak/>
         <w:t>Système de jeu</w:t>
       </w:r>
     </w:p>
@@ -206,6 +306,9 @@
         <w:pStyle w:val="Titre2"/>
       </w:pPr>
       <w:r>
+        <w:rPr>
+          <w:highlight w:val="cyan"/>
+        </w:rPr>
         <w:t>Gameplay</w:t>
       </w:r>
     </w:p>
@@ -259,59 +362,234 @@
     <w:p/>
     <w:p>
       <w:r>
+        <w:t xml:space="preserve">On pourrait observer la civilisation naissante et tenter de comprendre leurs comportements, habitudes, langues. On pourrait donc intervenir en vérifiant nos observations sur la population. </w:t>
+      </w:r>
+    </w:p>
+    <w:p/>
+    <w:p>
+      <w:r>
+        <w:t xml:space="preserve">Avec l'exemple de la pomme donnée à un individu, </w:t>
+      </w:r>
+      <w:r>
+        <w:t xml:space="preserve">ce dernier </w:t>
+      </w:r>
+      <w:r>
+        <w:t xml:space="preserve">pourrait </w:t>
+      </w:r>
+      <w:r>
+        <w:t>la manger</w:t>
+      </w:r>
+      <w:r>
+        <w:t xml:space="preserve"> mais cela ne confirmera pas forcément l'hypothèse qu</w:t>
+      </w:r>
+      <w:r>
+        <w:t>e la civilisation</w:t>
+      </w:r>
+      <w:r>
+        <w:t xml:space="preserve"> aime ça. Il faudrait donc plusieurs confirmations en groupe pour vérifier un fait (coop). </w:t>
+      </w:r>
+    </w:p>
+    <w:p>
+      <w:r>
+        <w:t>Le but du jeu serait donc de à la fois découvrir et comprendre une civilisation mais également qu'elle survive le plus longtemps possible à travers les âges</w:t>
+      </w:r>
+    </w:p>
+    <w:p>
+      <w:r>
+        <w:t>C</w:t>
+      </w:r>
+      <w:r>
+        <w:t xml:space="preserve">omme dans </w:t>
+      </w:r>
+      <w:r>
+        <w:t>P</w:t>
+      </w:r>
+      <w:r>
+        <w:t xml:space="preserve">opulus ou </w:t>
+      </w:r>
+      <w:proofErr w:type="spellStart"/>
+      <w:r>
+        <w:t>Banished</w:t>
+      </w:r>
+      <w:proofErr w:type="spellEnd"/>
+      <w:r>
+        <w:t xml:space="preserve"> on essaierait d'orienter la population avec nos interventions pour les faire vivre le plus longtemps possible</w:t>
+      </w:r>
+    </w:p>
+    <w:p>
+      <w:pPr>
+        <w:pStyle w:val="Titre3"/>
+      </w:pPr>
+      <w:r>
+        <w:t>Type de jeu</w:t>
+      </w:r>
+    </w:p>
+    <w:p>
+      <w:r>
+        <w:t>[remplir]</w:t>
+      </w:r>
+    </w:p>
+    <w:p>
+      <w:pPr>
+        <w:pStyle w:val="Titre3"/>
+      </w:pPr>
+      <w:r>
+        <w:t>Mécaniques principales et secondaires</w:t>
+      </w:r>
+    </w:p>
+    <w:p>
+      <w:r>
+        <w:t>[remplir]</w:t>
+      </w:r>
+    </w:p>
+    <w:p>
+      <w:pPr>
+        <w:pStyle w:val="Titre3"/>
+      </w:pPr>
+      <w:r>
+        <w:t>Modes de jeu</w:t>
+      </w:r>
+    </w:p>
+    <w:p>
+      <w:r>
+        <w:t>[remplir]</w:t>
+      </w:r>
+    </w:p>
+    <w:p>
+      <w:pPr>
+        <w:pStyle w:val="Titre3"/>
+      </w:pPr>
+      <w:r>
+        <w:t>Systèmes de progression</w:t>
+      </w:r>
+    </w:p>
+    <w:p>
+      <w:r>
+        <w:t>[remplir]</w:t>
+      </w:r>
+    </w:p>
+    <w:p>
+      <w:pPr>
+        <w:pStyle w:val="Titre3"/>
+      </w:pPr>
+      <w:r>
+        <w:t>Contrôles détaillés</w:t>
+      </w:r>
+    </w:p>
+    <w:p>
+      <w:r>
+        <w:t>[remplir]</w:t>
+      </w:r>
+    </w:p>
+    <w:p>
+      <w:pPr>
+        <w:pStyle w:val="Titre2"/>
+      </w:pPr>
+      <w:proofErr w:type="spellStart"/>
+      <w:r>
+        <w:rPr>
+          <w:highlight w:val="cyan"/>
+        </w:rPr>
+        <w:t>Level</w:t>
+      </w:r>
+      <w:proofErr w:type="spellEnd"/>
+      <w:r>
+        <w:rPr>
+          <w:highlight w:val="cyan"/>
+        </w:rPr>
+        <w:t xml:space="preserve"> design</w:t>
+      </w:r>
+    </w:p>
+    <w:p>
+      <w:pPr>
+        <w:pStyle w:val="Titre3"/>
+      </w:pPr>
+      <w:r>
+        <w:t>Architecture des niveaux</w:t>
+      </w:r>
+    </w:p>
+    <w:p>
+      <w:r>
+        <w:t>[remplir]</w:t>
+      </w:r>
+    </w:p>
+    <w:p>
+      <w:pPr>
+        <w:pStyle w:val="Titre3"/>
+      </w:pPr>
+      <w:r>
+        <w:t>Courbe de difficulté</w:t>
+      </w:r>
+    </w:p>
+    <w:p>
+      <w:r>
+        <w:t>[remplir]</w:t>
+      </w:r>
+    </w:p>
+    <w:p>
+      <w:pPr>
+        <w:pStyle w:val="Titre3"/>
+      </w:pPr>
+      <w:r>
+        <w:t>Systèmes de tutoriel</w:t>
+      </w:r>
+    </w:p>
+    <w:p>
+      <w:r>
+        <w:t>[remplir]</w:t>
+      </w:r>
+    </w:p>
+    <w:p>
+      <w:pPr>
+        <w:pStyle w:val="Titre3"/>
+      </w:pPr>
+      <w:r>
+        <w:t>Objectifs par niveau</w:t>
+      </w:r>
+    </w:p>
+    <w:p>
+      <w:r>
+        <w:t>[remplir]</w:t>
+      </w:r>
+    </w:p>
+    <w:p>
+      <w:pPr>
+        <w:pStyle w:val="Titre3"/>
+      </w:pPr>
+      <w:r>
+        <w:t>Balancing</w:t>
+      </w:r>
+    </w:p>
+    <w:p>
+      <w:r>
+        <w:t>[remplir]</w:t>
+      </w:r>
+    </w:p>
+    <w:p>
+      <w:pPr>
+        <w:pStyle w:val="Titre3"/>
+      </w:pPr>
+      <w:proofErr w:type="spellStart"/>
+      <w:r>
         <w:lastRenderedPageBreak/>
-        <w:t xml:space="preserve">On pourrait observer la civilisation naissante et tenter de comprendre leurs comportements, habitudes, langues. On pourrait donc intervenir en vérifiant nos observations sur la population. </w:t>
-      </w:r>
-    </w:p>
-    <w:p/>
-    <w:p>
-      <w:r>
-        <w:t xml:space="preserve">Avec l'exemple de la pomme donnée à un individu, </w:t>
-      </w:r>
-      <w:r>
-        <w:t xml:space="preserve">ce dernier </w:t>
-      </w:r>
-      <w:r>
-        <w:t xml:space="preserve">pourrait </w:t>
-      </w:r>
-      <w:r>
-        <w:t>la manger</w:t>
-      </w:r>
-      <w:r>
-        <w:t xml:space="preserve"> mais cela ne confirmera pas forcément l'hypothèse qu</w:t>
-      </w:r>
-      <w:r>
-        <w:t>e la civilisation</w:t>
-      </w:r>
-      <w:r>
-        <w:t xml:space="preserve"> aime ça. Il faudrait donc plusieurs confirmations en groupe pour vérifier un fait (coop). </w:t>
-      </w:r>
-    </w:p>
-    <w:p>
-      <w:r>
-        <w:t>Le but du jeu serait donc de à la fois découvrir et comprendre une civilisation mais également qu'elle survive le plus longtemps possible à travers les âges</w:t>
-      </w:r>
-    </w:p>
-    <w:p>
-      <w:r>
-        <w:t>C</w:t>
-      </w:r>
-      <w:r>
-        <w:t xml:space="preserve">omme dans </w:t>
-      </w:r>
-      <w:r>
-        <w:t>P</w:t>
-      </w:r>
-      <w:r>
-        <w:t xml:space="preserve">opulus ou </w:t>
-      </w:r>
-      <w:proofErr w:type="spellStart"/>
-      <w:r>
-        <w:t>Banished</w:t>
+        <w:t>Economics</w:t>
       </w:r>
       <w:proofErr w:type="spellEnd"/>
-      <w:r>
-        <w:t xml:space="preserve"> on essaierait d'orienter la population avec nos interventions pour les faire vivre le plus longtemps possible</w:t>
+    </w:p>
+    <w:p>
+      <w:r>
+        <w:t>[remplir]</w:t>
+      </w:r>
+    </w:p>
+    <w:p>
+      <w:pPr>
+        <w:pStyle w:val="Titre2"/>
+      </w:pPr>
+      <w:r>
+        <w:rPr>
+          <w:highlight w:val="green"/>
+        </w:rPr>
+        <w:t>IHM</w:t>
       </w:r>
     </w:p>
     <w:p>
@@ -319,7 +597,7 @@
         <w:pStyle w:val="Titre3"/>
       </w:pPr>
       <w:r>
-        <w:t>Type de jeu</w:t>
+        <w:t>GUI et menus</w:t>
       </w:r>
     </w:p>
     <w:p>
@@ -332,7 +610,7 @@
         <w:pStyle w:val="Titre3"/>
       </w:pPr>
       <w:r>
-        <w:t>Mécaniques principales et secondaires</w:t>
+        <w:t>Flow des interfaces</w:t>
       </w:r>
     </w:p>
     <w:p>
@@ -345,7 +623,7 @@
         <w:pStyle w:val="Titre3"/>
       </w:pPr>
       <w:r>
-        <w:t>Modes de jeu</w:t>
+        <w:t>Système de feedback</w:t>
       </w:r>
     </w:p>
     <w:p>
@@ -358,173 +636,6 @@
         <w:pStyle w:val="Titre3"/>
       </w:pPr>
       <w:r>
-        <w:t>Systèmes de progression</w:t>
-      </w:r>
-    </w:p>
-    <w:p>
-      <w:r>
-        <w:t>[remplir]</w:t>
-      </w:r>
-    </w:p>
-    <w:p>
-      <w:pPr>
-        <w:pStyle w:val="Titre3"/>
-      </w:pPr>
-      <w:r>
-        <w:t>Contrôles détaillés</w:t>
-      </w:r>
-    </w:p>
-    <w:p>
-      <w:r>
-        <w:t>[remplir]</w:t>
-      </w:r>
-    </w:p>
-    <w:p>
-      <w:pPr>
-        <w:pStyle w:val="Titre2"/>
-      </w:pPr>
-      <w:proofErr w:type="spellStart"/>
-      <w:r>
-        <w:t>Level</w:t>
-      </w:r>
-      <w:proofErr w:type="spellEnd"/>
-      <w:r>
-        <w:t xml:space="preserve"> design</w:t>
-      </w:r>
-    </w:p>
-    <w:p>
-      <w:pPr>
-        <w:pStyle w:val="Titre3"/>
-      </w:pPr>
-      <w:r>
-        <w:t>Architecture des niveaux</w:t>
-      </w:r>
-    </w:p>
-    <w:p>
-      <w:r>
-        <w:t>[remplir]</w:t>
-      </w:r>
-    </w:p>
-    <w:p>
-      <w:pPr>
-        <w:pStyle w:val="Titre3"/>
-      </w:pPr>
-      <w:r>
-        <w:t>Courbe de difficulté</w:t>
-      </w:r>
-    </w:p>
-    <w:p>
-      <w:r>
-        <w:t>[remplir]</w:t>
-      </w:r>
-    </w:p>
-    <w:p>
-      <w:pPr>
-        <w:pStyle w:val="Titre3"/>
-      </w:pPr>
-      <w:r>
-        <w:t>Systèmes de tutoriel</w:t>
-      </w:r>
-    </w:p>
-    <w:p>
-      <w:r>
-        <w:t>[remplir]</w:t>
-      </w:r>
-    </w:p>
-    <w:p>
-      <w:pPr>
-        <w:pStyle w:val="Titre3"/>
-      </w:pPr>
-      <w:r>
-        <w:t>Objectifs par niveau</w:t>
-      </w:r>
-    </w:p>
-    <w:p>
-      <w:r>
-        <w:t>[remplir]</w:t>
-      </w:r>
-    </w:p>
-    <w:p>
-      <w:pPr>
-        <w:pStyle w:val="Titre3"/>
-      </w:pPr>
-      <w:r>
-        <w:t>Balancing</w:t>
-      </w:r>
-    </w:p>
-    <w:p>
-      <w:r>
-        <w:t>[remplir]</w:t>
-      </w:r>
-    </w:p>
-    <w:p>
-      <w:pPr>
-        <w:pStyle w:val="Titre3"/>
-      </w:pPr>
-      <w:proofErr w:type="spellStart"/>
-      <w:r>
-        <w:t>Economics</w:t>
-      </w:r>
-      <w:proofErr w:type="spellEnd"/>
-    </w:p>
-    <w:p>
-      <w:r>
-        <w:t>[remplir]</w:t>
-      </w:r>
-    </w:p>
-    <w:p>
-      <w:pPr>
-        <w:pStyle w:val="Titre2"/>
-      </w:pPr>
-      <w:r>
-        <w:t>IHM</w:t>
-      </w:r>
-    </w:p>
-    <w:p>
-      <w:pPr>
-        <w:pStyle w:val="Titre3"/>
-      </w:pPr>
-      <w:r>
-        <w:t>GUI et menus</w:t>
-      </w:r>
-    </w:p>
-    <w:p>
-      <w:r>
-        <w:t>[remplir]</w:t>
-      </w:r>
-    </w:p>
-    <w:p>
-      <w:pPr>
-        <w:pStyle w:val="Titre3"/>
-      </w:pPr>
-      <w:r>
-        <w:t>Flow des interfaces</w:t>
-      </w:r>
-    </w:p>
-    <w:p>
-      <w:r>
-        <w:t>[remplir]</w:t>
-      </w:r>
-    </w:p>
-    <w:p>
-      <w:pPr>
-        <w:pStyle w:val="Titre3"/>
-      </w:pPr>
-      <w:r>
-        <w:t>Système de feedback</w:t>
-      </w:r>
-    </w:p>
-    <w:p>
-      <w:r>
-        <w:t>[remplir]</w:t>
-      </w:r>
-    </w:p>
-    <w:p>
-      <w:pPr>
-        <w:pStyle w:val="Titre3"/>
-      </w:pPr>
-      <w:r>
-        <w:lastRenderedPageBreak/>
         <w:t>UX</w:t>
       </w:r>
     </w:p>
@@ -553,8 +664,14 @@
           <w:ilvl w:val="0"/>
           <w:numId w:val="1"/>
         </w:numPr>
-      </w:pPr>
-      <w:r>
+        <w:rPr>
+          <w:highlight w:val="yellow"/>
+        </w:rPr>
+      </w:pPr>
+      <w:r>
+        <w:rPr>
+          <w:highlight w:val="yellow"/>
+        </w:rPr>
         <w:t>Technique</w:t>
       </w:r>
     </w:p>
@@ -591,8 +708,14 @@
           <w:ilvl w:val="0"/>
           <w:numId w:val="1"/>
         </w:numPr>
-      </w:pPr>
-      <w:r>
+        <w:rPr>
+          <w:highlight w:val="yellow"/>
+        </w:rPr>
+      </w:pPr>
+      <w:r>
+        <w:rPr>
+          <w:highlight w:val="yellow"/>
+        </w:rPr>
         <w:t>Production</w:t>
       </w:r>
     </w:p>
@@ -644,6 +767,9 @@
         <w:pStyle w:val="Titre2"/>
       </w:pPr>
       <w:r>
+        <w:rPr>
+          <w:highlight w:val="green"/>
+        </w:rPr>
         <w:t>Marketing/Communication</w:t>
       </w:r>
     </w:p>
@@ -657,6 +783,9 @@
         <w:pStyle w:val="Titre2"/>
       </w:pPr>
       <w:r>
+        <w:rPr>
+          <w:highlight w:val="yellow"/>
+        </w:rPr>
         <w:t>Business model</w:t>
       </w:r>
     </w:p>
@@ -670,6 +799,9 @@
         <w:pStyle w:val="Titre2"/>
       </w:pPr>
       <w:r>
+        <w:rPr>
+          <w:highlight w:val="yellow"/>
+        </w:rPr>
         <w:t>Rémunération</w:t>
       </w:r>
     </w:p>

</xml_diff>

<commit_message>
Update de la répartition des tâches
</commit_message>
<xml_diff>
--- a/GDD.docx
+++ b/GDD.docx
@@ -74,6 +74,9 @@
         <w:pStyle w:val="Titre2"/>
       </w:pPr>
       <w:r>
+        <w:rPr>
+          <w:highlight w:val="magenta"/>
+        </w:rPr>
         <w:t>Introduction</w:t>
       </w:r>
     </w:p>
@@ -123,6 +126,9 @@
         <w:pStyle w:val="Titre2"/>
       </w:pPr>
       <w:r>
+        <w:rPr>
+          <w:highlight w:val="magenta"/>
+        </w:rPr>
         <w:t>Univers</w:t>
       </w:r>
     </w:p>
@@ -136,6 +142,9 @@
         <w:pStyle w:val="Titre2"/>
       </w:pPr>
       <w:r>
+        <w:rPr>
+          <w:highlight w:val="magenta"/>
+        </w:rPr>
         <w:t>Public cible</w:t>
       </w:r>
     </w:p>
@@ -153,7 +162,16 @@
         </w:numPr>
       </w:pPr>
       <w:r>
-        <w:t>Contenu</w:t>
+        <w:rPr>
+          <w:highlight w:val="magenta"/>
+        </w:rPr>
+        <w:t>Con</w:t>
+      </w:r>
+      <w:r>
+        <w:rPr>
+          <w:highlight w:val="red"/>
+        </w:rPr>
+        <w:t>tenu</w:t>
       </w:r>
     </w:p>
     <w:p>
@@ -297,8 +315,20 @@
         </w:numPr>
       </w:pPr>
       <w:r>
+        <w:rPr>
+          <w:highlight w:val="cyan"/>
+        </w:rPr>
         <w:lastRenderedPageBreak/>
-        <w:t>Système de jeu</w:t>
+        <w:t>Système</w:t>
+      </w:r>
+      <w:r>
+        <w:t xml:space="preserve"> </w:t>
+      </w:r>
+      <w:r>
+        <w:rPr>
+          <w:highlight w:val="red"/>
+        </w:rPr>
+        <w:t>de jeu</w:t>
       </w:r>
     </w:p>
     <w:p>
@@ -317,6 +347,9 @@
         <w:pStyle w:val="Titre3"/>
       </w:pPr>
       <w:r>
+        <w:rPr>
+          <w:highlight w:val="cyan"/>
+        </w:rPr>
         <w:t>Les 3C</w:t>
       </w:r>
     </w:p>
@@ -330,6 +363,9 @@
         <w:pStyle w:val="Titre3"/>
       </w:pPr>
       <w:r>
+        <w:rPr>
+          <w:highlight w:val="cyan"/>
+        </w:rPr>
         <w:t>Boucle de gameplay principale</w:t>
       </w:r>
     </w:p>
@@ -421,6 +457,9 @@
         <w:pStyle w:val="Titre3"/>
       </w:pPr>
       <w:r>
+        <w:rPr>
+          <w:highlight w:val="cyan"/>
+        </w:rPr>
         <w:t>Type de jeu</w:t>
       </w:r>
     </w:p>
@@ -434,6 +473,9 @@
         <w:pStyle w:val="Titre3"/>
       </w:pPr>
       <w:r>
+        <w:rPr>
+          <w:highlight w:val="cyan"/>
+        </w:rPr>
         <w:t>Mécaniques principales et secondaires</w:t>
       </w:r>
     </w:p>
@@ -447,6 +489,9 @@
         <w:pStyle w:val="Titre3"/>
       </w:pPr>
       <w:r>
+        <w:rPr>
+          <w:highlight w:val="cyan"/>
+        </w:rPr>
         <w:t>Modes de jeu</w:t>
       </w:r>
     </w:p>
@@ -460,6 +505,9 @@
         <w:pStyle w:val="Titre3"/>
       </w:pPr>
       <w:r>
+        <w:rPr>
+          <w:highlight w:val="cyan"/>
+        </w:rPr>
         <w:t>Systèmes de progression</w:t>
       </w:r>
     </w:p>
@@ -473,6 +521,9 @@
         <w:pStyle w:val="Titre3"/>
       </w:pPr>
       <w:r>
+        <w:rPr>
+          <w:highlight w:val="cyan"/>
+        </w:rPr>
         <w:t>Contrôles détaillés</w:t>
       </w:r>
     </w:p>
@@ -488,14 +539,14 @@
       <w:proofErr w:type="spellStart"/>
       <w:r>
         <w:rPr>
-          <w:highlight w:val="cyan"/>
+          <w:highlight w:val="red"/>
         </w:rPr>
         <w:t>Level</w:t>
       </w:r>
       <w:proofErr w:type="spellEnd"/>
       <w:r>
         <w:rPr>
-          <w:highlight w:val="cyan"/>
+          <w:highlight w:val="red"/>
         </w:rPr>
         <w:t xml:space="preserve"> design</w:t>
       </w:r>
@@ -505,6 +556,9 @@
         <w:pStyle w:val="Titre3"/>
       </w:pPr>
       <w:r>
+        <w:rPr>
+          <w:highlight w:val="red"/>
+        </w:rPr>
         <w:t>Architecture des niveaux</w:t>
       </w:r>
     </w:p>
@@ -518,6 +572,9 @@
         <w:pStyle w:val="Titre3"/>
       </w:pPr>
       <w:r>
+        <w:rPr>
+          <w:highlight w:val="red"/>
+        </w:rPr>
         <w:t>Courbe de difficulté</w:t>
       </w:r>
     </w:p>
@@ -531,6 +588,9 @@
         <w:pStyle w:val="Titre3"/>
       </w:pPr>
       <w:r>
+        <w:rPr>
+          <w:highlight w:val="red"/>
+        </w:rPr>
         <w:t>Systèmes de tutoriel</w:t>
       </w:r>
     </w:p>
@@ -544,6 +604,9 @@
         <w:pStyle w:val="Titre3"/>
       </w:pPr>
       <w:r>
+        <w:rPr>
+          <w:highlight w:val="red"/>
+        </w:rPr>
         <w:t>Objectifs par niveau</w:t>
       </w:r>
     </w:p>
@@ -557,6 +620,9 @@
         <w:pStyle w:val="Titre3"/>
       </w:pPr>
       <w:r>
+        <w:rPr>
+          <w:highlight w:val="red"/>
+        </w:rPr>
         <w:t>Balancing</w:t>
       </w:r>
     </w:p>
@@ -571,6 +637,9 @@
       </w:pPr>
       <w:proofErr w:type="spellStart"/>
       <w:r>
+        <w:rPr>
+          <w:highlight w:val="red"/>
+        </w:rPr>
         <w:lastRenderedPageBreak/>
         <w:t>Economics</w:t>
       </w:r>
@@ -597,6 +666,9 @@
         <w:pStyle w:val="Titre3"/>
       </w:pPr>
       <w:r>
+        <w:rPr>
+          <w:highlight w:val="green"/>
+        </w:rPr>
         <w:t>GUI et menus</w:t>
       </w:r>
     </w:p>
@@ -610,6 +682,9 @@
         <w:pStyle w:val="Titre3"/>
       </w:pPr>
       <w:r>
+        <w:rPr>
+          <w:highlight w:val="green"/>
+        </w:rPr>
         <w:t>Flow des interfaces</w:t>
       </w:r>
     </w:p>
@@ -623,6 +698,9 @@
         <w:pStyle w:val="Titre3"/>
       </w:pPr>
       <w:r>
+        <w:rPr>
+          <w:highlight w:val="green"/>
+        </w:rPr>
         <w:t>Système de feedback</w:t>
       </w:r>
     </w:p>
@@ -636,6 +714,9 @@
         <w:pStyle w:val="Titre3"/>
       </w:pPr>
       <w:r>
+        <w:rPr>
+          <w:highlight w:val="green"/>
+        </w:rPr>
         <w:t>UX</w:t>
       </w:r>
     </w:p>
@@ -649,6 +730,9 @@
         <w:pStyle w:val="Titre3"/>
       </w:pPr>
       <w:r>
+        <w:rPr>
+          <w:highlight w:val="green"/>
+        </w:rPr>
         <w:t>Accessibilité</w:t>
       </w:r>
     </w:p>
@@ -680,6 +764,9 @@
         <w:pStyle w:val="Titre2"/>
       </w:pPr>
       <w:r>
+        <w:rPr>
+          <w:highlight w:val="yellow"/>
+        </w:rPr>
         <w:t>Technologies</w:t>
       </w:r>
     </w:p>
@@ -693,6 +780,9 @@
         <w:pStyle w:val="Titre2"/>
       </w:pPr>
       <w:r>
+        <w:rPr>
+          <w:highlight w:val="yellow"/>
+        </w:rPr>
         <w:t>Spécifications</w:t>
       </w:r>
     </w:p>
@@ -724,10 +814,16 @@
         <w:pStyle w:val="Titre2"/>
       </w:pPr>
       <w:r>
+        <w:rPr>
+          <w:highlight w:val="yellow"/>
+        </w:rPr>
         <w:t xml:space="preserve">TODO </w:t>
       </w:r>
       <w:proofErr w:type="spellStart"/>
       <w:r>
+        <w:rPr>
+          <w:highlight w:val="yellow"/>
+        </w:rPr>
         <w:t>list</w:t>
       </w:r>
       <w:proofErr w:type="spellEnd"/>
@@ -742,6 +838,9 @@
         <w:pStyle w:val="Titre2"/>
       </w:pPr>
       <w:r>
+        <w:rPr>
+          <w:highlight w:val="yellow"/>
+        </w:rPr>
         <w:t>Planning</w:t>
       </w:r>
     </w:p>
@@ -759,7 +858,16 @@
         </w:numPr>
       </w:pPr>
       <w:r>
-        <w:t>Business</w:t>
+        <w:rPr>
+          <w:highlight w:val="green"/>
+        </w:rPr>
+        <w:t>Busi</w:t>
+      </w:r>
+      <w:r>
+        <w:rPr>
+          <w:highlight w:val="yellow"/>
+        </w:rPr>
+        <w:t>ness</w:t>
       </w:r>
     </w:p>
     <w:p>

</xml_diff>